<commit_message>
Ajuste: arquivo do projeto
</commit_message>
<xml_diff>
--- a/docs/PA3_Aula04_AplicandoConhecimento_Grupo.docx
+++ b/docs/PA3_Aula04_AplicandoConhecimento_Grupo.docx
@@ -674,33 +674,6 @@
         </w:rPr>
         <w:br w:type="page"/>
       </w:r>
-    </w:p>
-    <w:p>
-      <w:pPr>
-        <w:jc w:val="both"/>
-        <w:rPr>
-          <w:rFonts w:ascii="Arial" w:eastAsia="Arial" w:hAnsi="Arial" w:cs="Arial"/>
-          <w:b/>
-          <w:color w:val="000000" w:themeColor="text1"/>
-          <w:sz w:val="24"/>
-          <w:szCs w:val="24"/>
-        </w:rPr>
-      </w:pPr>
-    </w:p>
-    <w:p>
-      <w:pPr>
-        <w:autoSpaceDE w:val="0"/>
-        <w:autoSpaceDN w:val="0"/>
-        <w:adjustRightInd w:val="0"/>
-        <w:spacing w:after="0"/>
-        <w:rPr>
-          <w:rFonts w:ascii="Arial" w:eastAsia="Arial" w:hAnsi="Arial" w:cs="Arial"/>
-          <w:b/>
-          <w:color w:val="000000" w:themeColor="text1"/>
-          <w:sz w:val="24"/>
-          <w:szCs w:val="24"/>
-        </w:rPr>
-      </w:pPr>
     </w:p>
     <w:p>
       <w:pPr>
@@ -797,7 +770,7 @@
           <w:r>
             <w:fldChar w:fldCharType="separate"/>
           </w:r>
-          <w:hyperlink w:anchor="_Toc229243913" w:history="1">
+          <w:hyperlink w:anchor="_Toc230158893" w:history="1">
             <w:r>
               <w:rPr>
                 <w:rStyle w:val="Hyperlink"/>
@@ -849,7 +822,7 @@
                 <w:noProof/>
                 <w:webHidden/>
               </w:rPr>
-              <w:instrText xml:space="preserve"> PAGEREF _Toc229243913 \h </w:instrText>
+              <w:instrText xml:space="preserve"> PAGEREF _Toc230158893 \h </w:instrText>
             </w:r>
             <w:r>
               <w:rPr>
@@ -869,7 +842,7 @@
                 <w:noProof/>
                 <w:webHidden/>
               </w:rPr>
-              <w:t>3</w:t>
+              <w:t>4</w:t>
             </w:r>
             <w:r>
               <w:rPr>
@@ -897,7 +870,7 @@
               <w14:ligatures w14:val="standardContextual"/>
             </w:rPr>
           </w:pPr>
-          <w:hyperlink w:anchor="_Toc229243914" w:history="1">
+          <w:hyperlink w:anchor="_Toc230158894" w:history="1">
             <w:r>
               <w:rPr>
                 <w:rStyle w:val="Hyperlink"/>
@@ -943,7 +916,7 @@
                 <w:noProof/>
                 <w:webHidden/>
               </w:rPr>
-              <w:instrText xml:space="preserve"> PAGEREF _Toc229243914 \h </w:instrText>
+              <w:instrText xml:space="preserve"> PAGEREF _Toc230158894 \h </w:instrText>
             </w:r>
             <w:r>
               <w:rPr>
@@ -963,7 +936,7 @@
                 <w:noProof/>
                 <w:webHidden/>
               </w:rPr>
-              <w:t>3</w:t>
+              <w:t>4</w:t>
             </w:r>
             <w:r>
               <w:rPr>
@@ -991,7 +964,7 @@
               <w14:ligatures w14:val="standardContextual"/>
             </w:rPr>
           </w:pPr>
-          <w:hyperlink w:anchor="_Toc229243915" w:history="1">
+          <w:hyperlink w:anchor="_Toc230158895" w:history="1">
             <w:r>
               <w:rPr>
                 <w:rStyle w:val="Hyperlink"/>
@@ -1037,7 +1010,7 @@
                 <w:noProof/>
                 <w:webHidden/>
               </w:rPr>
-              <w:instrText xml:space="preserve"> PAGEREF _Toc229243915 \h </w:instrText>
+              <w:instrText xml:space="preserve"> PAGEREF _Toc230158895 \h </w:instrText>
             </w:r>
             <w:r>
               <w:rPr>
@@ -1057,7 +1030,7 @@
                 <w:noProof/>
                 <w:webHidden/>
               </w:rPr>
-              <w:t>3</w:t>
+              <w:t>4</w:t>
             </w:r>
             <w:r>
               <w:rPr>
@@ -1085,7 +1058,7 @@
               <w14:ligatures w14:val="standardContextual"/>
             </w:rPr>
           </w:pPr>
-          <w:hyperlink w:anchor="_Toc229243916" w:history="1">
+          <w:hyperlink w:anchor="_Toc230158896" w:history="1">
             <w:r>
               <w:rPr>
                 <w:rStyle w:val="Hyperlink"/>
@@ -1131,7 +1104,7 @@
                 <w:noProof/>
                 <w:webHidden/>
               </w:rPr>
-              <w:instrText xml:space="preserve"> PAGEREF _Toc229243916 \h </w:instrText>
+              <w:instrText xml:space="preserve"> PAGEREF _Toc230158896 \h </w:instrText>
             </w:r>
             <w:r>
               <w:rPr>
@@ -1151,7 +1124,7 @@
                 <w:noProof/>
                 <w:webHidden/>
               </w:rPr>
-              <w:t>3</w:t>
+              <w:t>4</w:t>
             </w:r>
             <w:r>
               <w:rPr>
@@ -1179,7 +1152,7 @@
               <w14:ligatures w14:val="standardContextual"/>
             </w:rPr>
           </w:pPr>
-          <w:hyperlink w:anchor="_Toc229243917" w:history="1">
+          <w:hyperlink w:anchor="_Toc230158897" w:history="1">
             <w:r>
               <w:rPr>
                 <w:rStyle w:val="Hyperlink"/>
@@ -1225,7 +1198,7 @@
                 <w:noProof/>
                 <w:webHidden/>
               </w:rPr>
-              <w:instrText xml:space="preserve"> PAGEREF _Toc229243917 \h </w:instrText>
+              <w:instrText xml:space="preserve"> PAGEREF _Toc230158897 \h </w:instrText>
             </w:r>
             <w:r>
               <w:rPr>
@@ -1245,7 +1218,7 @@
                 <w:noProof/>
                 <w:webHidden/>
               </w:rPr>
-              <w:t>4</w:t>
+              <w:t>5</w:t>
             </w:r>
             <w:r>
               <w:rPr>
@@ -1273,7 +1246,7 @@
               <w14:ligatures w14:val="standardContextual"/>
             </w:rPr>
           </w:pPr>
-          <w:hyperlink w:anchor="_Toc229243918" w:history="1">
+          <w:hyperlink w:anchor="_Toc230158898" w:history="1">
             <w:r>
               <w:rPr>
                 <w:rStyle w:val="Hyperlink"/>
@@ -1323,7 +1296,7 @@
                 <w:noProof/>
                 <w:webHidden/>
               </w:rPr>
-              <w:instrText xml:space="preserve"> PAGEREF _Toc229243918 \h </w:instrText>
+              <w:instrText xml:space="preserve"> PAGEREF _Toc230158898 \h </w:instrText>
             </w:r>
             <w:r>
               <w:rPr>
@@ -1343,7 +1316,7 @@
                 <w:noProof/>
                 <w:webHidden/>
               </w:rPr>
-              <w:t>5</w:t>
+              <w:t>6</w:t>
             </w:r>
             <w:r>
               <w:rPr>
@@ -1371,7 +1344,7 @@
               <w14:ligatures w14:val="standardContextual"/>
             </w:rPr>
           </w:pPr>
-          <w:hyperlink w:anchor="_Toc229243919" w:history="1">
+          <w:hyperlink w:anchor="_Toc230158899" w:history="1">
             <w:r>
               <w:rPr>
                 <w:rStyle w:val="Hyperlink"/>
@@ -1421,7 +1394,7 @@
                 <w:noProof/>
                 <w:webHidden/>
               </w:rPr>
-              <w:instrText xml:space="preserve"> PAGEREF _Toc229243919 \h </w:instrText>
+              <w:instrText xml:space="preserve"> PAGEREF _Toc230158899 \h </w:instrText>
             </w:r>
             <w:r>
               <w:rPr>
@@ -1441,7 +1414,7 @@
                 <w:noProof/>
                 <w:webHidden/>
               </w:rPr>
-              <w:t>6</w:t>
+              <w:t>7</w:t>
             </w:r>
             <w:r>
               <w:rPr>
@@ -1469,7 +1442,7 @@
               <w14:ligatures w14:val="standardContextual"/>
             </w:rPr>
           </w:pPr>
-          <w:hyperlink w:anchor="_Toc229243920" w:history="1">
+          <w:hyperlink w:anchor="_Toc230158900" w:history="1">
             <w:r>
               <w:rPr>
                 <w:rStyle w:val="Hyperlink"/>
@@ -1519,7 +1492,7 @@
                 <w:noProof/>
                 <w:webHidden/>
               </w:rPr>
-              <w:instrText xml:space="preserve"> PAGEREF _Toc229243920 \h </w:instrText>
+              <w:instrText xml:space="preserve"> PAGEREF _Toc230158900 \h </w:instrText>
             </w:r>
             <w:r>
               <w:rPr>
@@ -1539,7 +1512,7 @@
                 <w:noProof/>
                 <w:webHidden/>
               </w:rPr>
-              <w:t>7</w:t>
+              <w:t>8</w:t>
             </w:r>
             <w:r>
               <w:rPr>
@@ -1567,7 +1540,7 @@
               <w14:ligatures w14:val="standardContextual"/>
             </w:rPr>
           </w:pPr>
-          <w:hyperlink w:anchor="_Toc229243921" w:history="1">
+          <w:hyperlink w:anchor="_Toc230158901" w:history="1">
             <w:r>
               <w:rPr>
                 <w:rStyle w:val="Hyperlink"/>
@@ -1613,7 +1586,7 @@
                 <w:noProof/>
                 <w:webHidden/>
               </w:rPr>
-              <w:instrText xml:space="preserve"> PAGEREF _Toc229243921 \h </w:instrText>
+              <w:instrText xml:space="preserve"> PAGEREF _Toc230158901 \h </w:instrText>
             </w:r>
             <w:r>
               <w:rPr>
@@ -1633,7 +1606,7 @@
                 <w:noProof/>
                 <w:webHidden/>
               </w:rPr>
-              <w:t>7</w:t>
+              <w:t>8</w:t>
             </w:r>
             <w:r>
               <w:rPr>
@@ -1661,7 +1634,7 @@
               <w14:ligatures w14:val="standardContextual"/>
             </w:rPr>
           </w:pPr>
-          <w:hyperlink w:anchor="_Toc229243922" w:history="1">
+          <w:hyperlink w:anchor="_Toc230158902" w:history="1">
             <w:r>
               <w:rPr>
                 <w:rStyle w:val="Hyperlink"/>
@@ -1707,7 +1680,7 @@
                 <w:noProof/>
                 <w:webHidden/>
               </w:rPr>
-              <w:instrText xml:space="preserve"> PAGEREF _Toc229243922 \h </w:instrText>
+              <w:instrText xml:space="preserve"> PAGEREF _Toc230158902 \h </w:instrText>
             </w:r>
             <w:r>
               <w:rPr>
@@ -1727,7 +1700,7 @@
                 <w:noProof/>
                 <w:webHidden/>
               </w:rPr>
-              <w:t>7</w:t>
+              <w:t>8</w:t>
             </w:r>
             <w:r>
               <w:rPr>
@@ -1755,7 +1728,7 @@
               <w14:ligatures w14:val="standardContextual"/>
             </w:rPr>
           </w:pPr>
-          <w:hyperlink w:anchor="_Toc229243923" w:history="1">
+          <w:hyperlink w:anchor="_Toc230158903" w:history="1">
             <w:r>
               <w:rPr>
                 <w:rStyle w:val="Hyperlink"/>
@@ -1801,7 +1774,7 @@
                 <w:noProof/>
                 <w:webHidden/>
               </w:rPr>
-              <w:instrText xml:space="preserve"> PAGEREF _Toc229243923 \h </w:instrText>
+              <w:instrText xml:space="preserve"> PAGEREF _Toc230158903 \h </w:instrText>
             </w:r>
             <w:r>
               <w:rPr>
@@ -1821,7 +1794,7 @@
                 <w:noProof/>
                 <w:webHidden/>
               </w:rPr>
-              <w:t>8</w:t>
+              <w:t>9</w:t>
             </w:r>
             <w:r>
               <w:rPr>
@@ -1849,7 +1822,7 @@
               <w14:ligatures w14:val="standardContextual"/>
             </w:rPr>
           </w:pPr>
-          <w:hyperlink w:anchor="_Toc229243924" w:history="1">
+          <w:hyperlink w:anchor="_Toc230158904" w:history="1">
             <w:r>
               <w:rPr>
                 <w:rStyle w:val="Hyperlink"/>
@@ -1895,7 +1868,7 @@
                 <w:noProof/>
                 <w:webHidden/>
               </w:rPr>
-              <w:instrText xml:space="preserve"> PAGEREF _Toc229243924 \h </w:instrText>
+              <w:instrText xml:space="preserve"> PAGEREF _Toc230158904 \h </w:instrText>
             </w:r>
             <w:r>
               <w:rPr>
@@ -1915,7 +1888,7 @@
                 <w:noProof/>
                 <w:webHidden/>
               </w:rPr>
-              <w:t>8</w:t>
+              <w:t>9</w:t>
             </w:r>
             <w:r>
               <w:rPr>
@@ -1943,7 +1916,7 @@
               <w14:ligatures w14:val="standardContextual"/>
             </w:rPr>
           </w:pPr>
-          <w:hyperlink w:anchor="_Toc229243925" w:history="1">
+          <w:hyperlink w:anchor="_Toc230158905" w:history="1">
             <w:r>
               <w:rPr>
                 <w:rStyle w:val="Hyperlink"/>
@@ -1989,7 +1962,7 @@
                 <w:noProof/>
                 <w:webHidden/>
               </w:rPr>
-              <w:instrText xml:space="preserve"> PAGEREF _Toc229243925 \h </w:instrText>
+              <w:instrText xml:space="preserve"> PAGEREF _Toc230158905 \h </w:instrText>
             </w:r>
             <w:r>
               <w:rPr>
@@ -2009,7 +1982,7 @@
                 <w:noProof/>
                 <w:webHidden/>
               </w:rPr>
-              <w:t>8</w:t>
+              <w:t>9</w:t>
             </w:r>
             <w:r>
               <w:rPr>
@@ -2037,7 +2010,7 @@
               <w14:ligatures w14:val="standardContextual"/>
             </w:rPr>
           </w:pPr>
-          <w:hyperlink w:anchor="_Toc229243926" w:history="1">
+          <w:hyperlink w:anchor="_Toc230158906" w:history="1">
             <w:r>
               <w:rPr>
                 <w:rStyle w:val="Hyperlink"/>
@@ -2083,7 +2056,7 @@
                 <w:noProof/>
                 <w:webHidden/>
               </w:rPr>
-              <w:instrText xml:space="preserve"> PAGEREF _Toc229243926 \h </w:instrText>
+              <w:instrText xml:space="preserve"> PAGEREF _Toc230158906 \h </w:instrText>
             </w:r>
             <w:r>
               <w:rPr>
@@ -2103,7 +2076,7 @@
                 <w:noProof/>
                 <w:webHidden/>
               </w:rPr>
-              <w:t>8</w:t>
+              <w:t>9</w:t>
             </w:r>
             <w:r>
               <w:rPr>
@@ -2131,7 +2104,7 @@
               <w14:ligatures w14:val="standardContextual"/>
             </w:rPr>
           </w:pPr>
-          <w:hyperlink w:anchor="_Toc229243927" w:history="1">
+          <w:hyperlink w:anchor="_Toc230158907" w:history="1">
             <w:r>
               <w:rPr>
                 <w:rStyle w:val="Hyperlink"/>
@@ -2177,7 +2150,7 @@
                 <w:noProof/>
                 <w:webHidden/>
               </w:rPr>
-              <w:instrText xml:space="preserve"> PAGEREF _Toc229243927 \h </w:instrText>
+              <w:instrText xml:space="preserve"> PAGEREF _Toc230158907 \h </w:instrText>
             </w:r>
             <w:r>
               <w:rPr>
@@ -2197,7 +2170,7 @@
                 <w:noProof/>
                 <w:webHidden/>
               </w:rPr>
-              <w:t>8</w:t>
+              <w:t>9</w:t>
             </w:r>
             <w:r>
               <w:rPr>
@@ -2225,7 +2198,7 @@
               <w14:ligatures w14:val="standardContextual"/>
             </w:rPr>
           </w:pPr>
-          <w:hyperlink w:anchor="_Toc229243928" w:history="1">
+          <w:hyperlink w:anchor="_Toc230158908" w:history="1">
             <w:r>
               <w:rPr>
                 <w:rStyle w:val="Hyperlink"/>
@@ -2271,7 +2244,7 @@
                 <w:noProof/>
                 <w:webHidden/>
               </w:rPr>
-              <w:instrText xml:space="preserve"> PAGEREF _Toc229243928 \h </w:instrText>
+              <w:instrText xml:space="preserve"> PAGEREF _Toc230158908 \h </w:instrText>
             </w:r>
             <w:r>
               <w:rPr>
@@ -2291,7 +2264,7 @@
                 <w:noProof/>
                 <w:webHidden/>
               </w:rPr>
-              <w:t>8</w:t>
+              <w:t>9</w:t>
             </w:r>
             <w:r>
               <w:rPr>
@@ -2319,7 +2292,7 @@
               <w14:ligatures w14:val="standardContextual"/>
             </w:rPr>
           </w:pPr>
-          <w:hyperlink w:anchor="_Toc229243929" w:history="1">
+          <w:hyperlink w:anchor="_Toc230158909" w:history="1">
             <w:r>
               <w:rPr>
                 <w:rStyle w:val="Hyperlink"/>
@@ -2369,7 +2342,7 @@
                 <w:noProof/>
                 <w:webHidden/>
               </w:rPr>
-              <w:instrText xml:space="preserve"> PAGEREF _Toc229243929 \h </w:instrText>
+              <w:instrText xml:space="preserve"> PAGEREF _Toc230158909 \h </w:instrText>
             </w:r>
             <w:r>
               <w:rPr>
@@ -2389,7 +2362,7 @@
                 <w:noProof/>
                 <w:webHidden/>
               </w:rPr>
-              <w:t>9</w:t>
+              <w:t>10</w:t>
             </w:r>
             <w:r>
               <w:rPr>
@@ -2417,7 +2390,7 @@
               <w14:ligatures w14:val="standardContextual"/>
             </w:rPr>
           </w:pPr>
-          <w:hyperlink w:anchor="_Toc229243930" w:history="1">
+          <w:hyperlink w:anchor="_Toc230158910" w:history="1">
             <w:r>
               <w:rPr>
                 <w:rStyle w:val="Hyperlink"/>
@@ -2463,7 +2436,7 @@
                 <w:noProof/>
                 <w:webHidden/>
               </w:rPr>
-              <w:instrText xml:space="preserve"> PAGEREF _Toc229243930 \h </w:instrText>
+              <w:instrText xml:space="preserve"> PAGEREF _Toc230158910 \h </w:instrText>
             </w:r>
             <w:r>
               <w:rPr>
@@ -2483,7 +2456,7 @@
                 <w:noProof/>
                 <w:webHidden/>
               </w:rPr>
-              <w:t>9</w:t>
+              <w:t>10</w:t>
             </w:r>
             <w:r>
               <w:rPr>
@@ -2511,7 +2484,7 @@
               <w14:ligatures w14:val="standardContextual"/>
             </w:rPr>
           </w:pPr>
-          <w:hyperlink w:anchor="_Toc229243931" w:history="1">
+          <w:hyperlink w:anchor="_Toc230158911" w:history="1">
             <w:r>
               <w:rPr>
                 <w:rStyle w:val="Hyperlink"/>
@@ -2557,7 +2530,7 @@
                 <w:noProof/>
                 <w:webHidden/>
               </w:rPr>
-              <w:instrText xml:space="preserve"> PAGEREF _Toc229243931 \h </w:instrText>
+              <w:instrText xml:space="preserve"> PAGEREF _Toc230158911 \h </w:instrText>
             </w:r>
             <w:r>
               <w:rPr>
@@ -2577,7 +2550,7 @@
                 <w:noProof/>
                 <w:webHidden/>
               </w:rPr>
-              <w:t>10</w:t>
+              <w:t>11</w:t>
             </w:r>
             <w:r>
               <w:rPr>
@@ -2605,7 +2578,7 @@
               <w14:ligatures w14:val="standardContextual"/>
             </w:rPr>
           </w:pPr>
-          <w:hyperlink w:anchor="_Toc229243932" w:history="1">
+          <w:hyperlink w:anchor="_Toc230158912" w:history="1">
             <w:r>
               <w:rPr>
                 <w:rStyle w:val="Hyperlink"/>
@@ -2651,7 +2624,7 @@
                 <w:noProof/>
                 <w:webHidden/>
               </w:rPr>
-              <w:instrText xml:space="preserve"> PAGEREF _Toc229243932 \h </w:instrText>
+              <w:instrText xml:space="preserve"> PAGEREF _Toc230158912 \h </w:instrText>
             </w:r>
             <w:r>
               <w:rPr>
@@ -2671,7 +2644,7 @@
                 <w:noProof/>
                 <w:webHidden/>
               </w:rPr>
-              <w:t>11</w:t>
+              <w:t>12</w:t>
             </w:r>
             <w:r>
               <w:rPr>
@@ -2699,7 +2672,7 @@
               <w14:ligatures w14:val="standardContextual"/>
             </w:rPr>
           </w:pPr>
-          <w:hyperlink w:anchor="_Toc229243933" w:history="1">
+          <w:hyperlink w:anchor="_Toc230158913" w:history="1">
             <w:r>
               <w:rPr>
                 <w:rStyle w:val="Hyperlink"/>
@@ -2745,7 +2718,7 @@
                 <w:noProof/>
                 <w:webHidden/>
               </w:rPr>
-              <w:instrText xml:space="preserve"> PAGEREF _Toc229243933 \h </w:instrText>
+              <w:instrText xml:space="preserve"> PAGEREF _Toc230158913 \h </w:instrText>
             </w:r>
             <w:r>
               <w:rPr>
@@ -2765,7 +2738,7 @@
                 <w:noProof/>
                 <w:webHidden/>
               </w:rPr>
-              <w:t>13</w:t>
+              <w:t>14</w:t>
             </w:r>
             <w:r>
               <w:rPr>
@@ -2793,7 +2766,7 @@
               <w14:ligatures w14:val="standardContextual"/>
             </w:rPr>
           </w:pPr>
-          <w:hyperlink w:anchor="_Toc229243934" w:history="1">
+          <w:hyperlink w:anchor="_Toc230158914" w:history="1">
             <w:r>
               <w:rPr>
                 <w:rStyle w:val="Hyperlink"/>
@@ -2839,7 +2812,7 @@
                 <w:noProof/>
                 <w:webHidden/>
               </w:rPr>
-              <w:instrText xml:space="preserve"> PAGEREF _Toc229243934 \h </w:instrText>
+              <w:instrText xml:space="preserve"> PAGEREF _Toc230158914 \h </w:instrText>
             </w:r>
             <w:r>
               <w:rPr>
@@ -2859,7 +2832,7 @@
                 <w:noProof/>
                 <w:webHidden/>
               </w:rPr>
-              <w:t>15</w:t>
+              <w:t>16</w:t>
             </w:r>
             <w:r>
               <w:rPr>
@@ -2887,7 +2860,7 @@
               <w14:ligatures w14:val="standardContextual"/>
             </w:rPr>
           </w:pPr>
-          <w:hyperlink w:anchor="_Toc229243935" w:history="1">
+          <w:hyperlink w:anchor="_Toc230158915" w:history="1">
             <w:r>
               <w:rPr>
                 <w:rStyle w:val="Hyperlink"/>
@@ -2933,7 +2906,7 @@
                 <w:noProof/>
                 <w:webHidden/>
               </w:rPr>
-              <w:instrText xml:space="preserve"> PAGEREF _Toc229243935 \h </w:instrText>
+              <w:instrText xml:space="preserve"> PAGEREF _Toc230158915 \h </w:instrText>
             </w:r>
             <w:r>
               <w:rPr>
@@ -2953,7 +2926,7 @@
                 <w:noProof/>
                 <w:webHidden/>
               </w:rPr>
-              <w:t>16</w:t>
+              <w:t>17</w:t>
             </w:r>
             <w:r>
               <w:rPr>
@@ -2981,7 +2954,7 @@
               <w14:ligatures w14:val="standardContextual"/>
             </w:rPr>
           </w:pPr>
-          <w:hyperlink w:anchor="_Toc229243936" w:history="1">
+          <w:hyperlink w:anchor="_Toc230158916" w:history="1">
             <w:r>
               <w:rPr>
                 <w:rStyle w:val="Hyperlink"/>
@@ -3033,7 +3006,7 @@
                 <w:noProof/>
                 <w:webHidden/>
               </w:rPr>
-              <w:instrText xml:space="preserve"> PAGEREF _Toc229243936 \h </w:instrText>
+              <w:instrText xml:space="preserve"> PAGEREF _Toc230158916 \h </w:instrText>
             </w:r>
             <w:r>
               <w:rPr>
@@ -3053,7 +3026,7 @@
                 <w:noProof/>
                 <w:webHidden/>
               </w:rPr>
-              <w:t>17</w:t>
+              <w:t>18</w:t>
             </w:r>
             <w:r>
               <w:rPr>
@@ -3081,7 +3054,7 @@
               <w14:ligatures w14:val="standardContextual"/>
             </w:rPr>
           </w:pPr>
-          <w:hyperlink w:anchor="_Toc229243937" w:history="1">
+          <w:hyperlink w:anchor="_Toc230158917" w:history="1">
             <w:r>
               <w:rPr>
                 <w:rStyle w:val="Hyperlink"/>
@@ -3131,7 +3104,7 @@
                 <w:noProof/>
                 <w:webHidden/>
               </w:rPr>
-              <w:instrText xml:space="preserve"> PAGEREF _Toc229243937 \h </w:instrText>
+              <w:instrText xml:space="preserve"> PAGEREF _Toc230158917 \h </w:instrText>
             </w:r>
             <w:r>
               <w:rPr>
@@ -3151,7 +3124,7 @@
                 <w:noProof/>
                 <w:webHidden/>
               </w:rPr>
-              <w:t>18</w:t>
+              <w:t>19</w:t>
             </w:r>
             <w:r>
               <w:rPr>
@@ -3179,7 +3152,7 @@
               <w14:ligatures w14:val="standardContextual"/>
             </w:rPr>
           </w:pPr>
-          <w:hyperlink w:anchor="_Toc229243938" w:history="1">
+          <w:hyperlink w:anchor="_Toc230158918" w:history="1">
             <w:r>
               <w:rPr>
                 <w:rStyle w:val="Hyperlink"/>
@@ -3229,7 +3202,7 @@
                 <w:noProof/>
                 <w:webHidden/>
               </w:rPr>
-              <w:instrText xml:space="preserve"> PAGEREF _Toc229243938 \h </w:instrText>
+              <w:instrText xml:space="preserve"> PAGEREF _Toc230158918 \h </w:instrText>
             </w:r>
             <w:r>
               <w:rPr>
@@ -3249,7 +3222,7 @@
                 <w:noProof/>
                 <w:webHidden/>
               </w:rPr>
-              <w:t>18</w:t>
+              <w:t>19</w:t>
             </w:r>
             <w:r>
               <w:rPr>
@@ -3277,12 +3250,13 @@
               <w14:ligatures w14:val="standardContextual"/>
             </w:rPr>
           </w:pPr>
-          <w:hyperlink w:anchor="_Toc229243939" w:history="1">
+          <w:hyperlink w:anchor="_Toc230158919" w:history="1">
             <w:r>
               <w:rPr>
                 <w:rStyle w:val="Hyperlink"/>
                 <w:rFonts w:ascii="Arial" w:hAnsi="Arial" w:cs="Arial"/>
                 <w:b/>
+                <w:bCs/>
                 <w:noProof/>
               </w:rPr>
               <w:t>9.</w:t>
@@ -3304,6 +3278,205 @@
                 <w:rStyle w:val="Hyperlink"/>
                 <w:rFonts w:ascii="Arial" w:hAnsi="Arial" w:cs="Arial"/>
                 <w:b/>
+                <w:bCs/>
+                <w:noProof/>
+              </w:rPr>
+              <w:t>Link para o vídeo</w:t>
+            </w:r>
+            <w:r>
+              <w:rPr>
+                <w:noProof/>
+                <w:webHidden/>
+              </w:rPr>
+              <w:tab/>
+            </w:r>
+            <w:r>
+              <w:rPr>
+                <w:noProof/>
+                <w:webHidden/>
+              </w:rPr>
+              <w:fldChar w:fldCharType="begin"/>
+            </w:r>
+            <w:r>
+              <w:rPr>
+                <w:noProof/>
+                <w:webHidden/>
+              </w:rPr>
+              <w:instrText xml:space="preserve"> PAGEREF _Toc230158919 \h </w:instrText>
+            </w:r>
+            <w:r>
+              <w:rPr>
+                <w:noProof/>
+                <w:webHidden/>
+              </w:rPr>
+            </w:r>
+            <w:r>
+              <w:rPr>
+                <w:noProof/>
+                <w:webHidden/>
+              </w:rPr>
+              <w:fldChar w:fldCharType="separate"/>
+            </w:r>
+            <w:r>
+              <w:rPr>
+                <w:noProof/>
+                <w:webHidden/>
+              </w:rPr>
+              <w:t>19</w:t>
+            </w:r>
+            <w:r>
+              <w:rPr>
+                <w:noProof/>
+                <w:webHidden/>
+              </w:rPr>
+              <w:fldChar w:fldCharType="end"/>
+            </w:r>
+          </w:hyperlink>
+        </w:p>
+        <w:p>
+          <w:pPr>
+            <w:pStyle w:val="Sumrio1"/>
+            <w:tabs>
+              <w:tab w:val="left" w:pos="720"/>
+              <w:tab w:val="right" w:leader="dot" w:pos="8494"/>
+            </w:tabs>
+            <w:rPr>
+              <w:rFonts w:eastAsiaTheme="minorEastAsia"/>
+              <w:noProof/>
+              <w:kern w:val="2"/>
+              <w:sz w:val="24"/>
+              <w:szCs w:val="24"/>
+              <w:lang w:eastAsia="pt-BR"/>
+              <w14:ligatures w14:val="standardContextual"/>
+            </w:rPr>
+          </w:pPr>
+          <w:hyperlink w:anchor="_Toc230158920" w:history="1">
+            <w:r>
+              <w:rPr>
+                <w:rStyle w:val="Hyperlink"/>
+                <w:rFonts w:ascii="Arial" w:hAnsi="Arial" w:cs="Arial"/>
+                <w:b/>
+                <w:bCs/>
+                <w:noProof/>
+              </w:rPr>
+              <w:t>10.</w:t>
+            </w:r>
+            <w:r>
+              <w:rPr>
+                <w:rFonts w:eastAsiaTheme="minorEastAsia"/>
+                <w:noProof/>
+                <w:kern w:val="2"/>
+                <w:sz w:val="24"/>
+                <w:szCs w:val="24"/>
+                <w:lang w:eastAsia="pt-BR"/>
+                <w14:ligatures w14:val="standardContextual"/>
+              </w:rPr>
+              <w:tab/>
+            </w:r>
+            <w:r>
+              <w:rPr>
+                <w:rStyle w:val="Hyperlink"/>
+                <w:rFonts w:ascii="Arial" w:hAnsi="Arial" w:cs="Arial"/>
+                <w:b/>
+                <w:bCs/>
+                <w:noProof/>
+              </w:rPr>
+              <w:t>Link para a Aplicação</w:t>
+            </w:r>
+            <w:r>
+              <w:rPr>
+                <w:noProof/>
+                <w:webHidden/>
+              </w:rPr>
+              <w:tab/>
+            </w:r>
+            <w:r>
+              <w:rPr>
+                <w:noProof/>
+                <w:webHidden/>
+              </w:rPr>
+              <w:fldChar w:fldCharType="begin"/>
+            </w:r>
+            <w:r>
+              <w:rPr>
+                <w:noProof/>
+                <w:webHidden/>
+              </w:rPr>
+              <w:instrText xml:space="preserve"> PAGEREF _Toc230158920 \h </w:instrText>
+            </w:r>
+            <w:r>
+              <w:rPr>
+                <w:noProof/>
+                <w:webHidden/>
+              </w:rPr>
+            </w:r>
+            <w:r>
+              <w:rPr>
+                <w:noProof/>
+                <w:webHidden/>
+              </w:rPr>
+              <w:fldChar w:fldCharType="separate"/>
+            </w:r>
+            <w:r>
+              <w:rPr>
+                <w:noProof/>
+                <w:webHidden/>
+              </w:rPr>
+              <w:t>19</w:t>
+            </w:r>
+            <w:r>
+              <w:rPr>
+                <w:noProof/>
+                <w:webHidden/>
+              </w:rPr>
+              <w:fldChar w:fldCharType="end"/>
+            </w:r>
+          </w:hyperlink>
+        </w:p>
+        <w:p>
+          <w:pPr>
+            <w:pStyle w:val="Sumrio1"/>
+            <w:tabs>
+              <w:tab w:val="left" w:pos="720"/>
+              <w:tab w:val="right" w:leader="dot" w:pos="8494"/>
+            </w:tabs>
+            <w:rPr>
+              <w:rFonts w:eastAsiaTheme="minorEastAsia"/>
+              <w:noProof/>
+              <w:kern w:val="2"/>
+              <w:sz w:val="24"/>
+              <w:szCs w:val="24"/>
+              <w:lang w:eastAsia="pt-BR"/>
+              <w14:ligatures w14:val="standardContextual"/>
+            </w:rPr>
+          </w:pPr>
+          <w:hyperlink w:anchor="_Toc230158921" w:history="1">
+            <w:r>
+              <w:rPr>
+                <w:rStyle w:val="Hyperlink"/>
+                <w:rFonts w:ascii="Arial" w:hAnsi="Arial" w:cs="Arial"/>
+                <w:b/>
+                <w:noProof/>
+              </w:rPr>
+              <w:t>11.</w:t>
+            </w:r>
+            <w:r>
+              <w:rPr>
+                <w:rFonts w:eastAsiaTheme="minorEastAsia"/>
+                <w:noProof/>
+                <w:kern w:val="2"/>
+                <w:sz w:val="24"/>
+                <w:szCs w:val="24"/>
+                <w:lang w:eastAsia="pt-BR"/>
+                <w14:ligatures w14:val="standardContextual"/>
+              </w:rPr>
+              <w:tab/>
+            </w:r>
+            <w:r>
+              <w:rPr>
+                <w:rStyle w:val="Hyperlink"/>
+                <w:rFonts w:ascii="Arial" w:hAnsi="Arial" w:cs="Arial"/>
+                <w:b/>
                 <w:noProof/>
               </w:rPr>
               <w:t>Referências Bibliográficas</w:t>
@@ -3327,7 +3500,7 @@
                 <w:noProof/>
                 <w:webHidden/>
               </w:rPr>
-              <w:instrText xml:space="preserve"> PAGEREF _Toc229243939 \h </w:instrText>
+              <w:instrText xml:space="preserve"> PAGEREF _Toc230158921 \h </w:instrText>
             </w:r>
             <w:r>
               <w:rPr>
@@ -3347,7 +3520,7 @@
                 <w:noProof/>
                 <w:webHidden/>
               </w:rPr>
-              <w:t>19</w:t>
+              <w:t>20</w:t>
             </w:r>
             <w:r>
               <w:rPr>
@@ -3413,7 +3586,7 @@
         </w:rPr>
         <w:br w:type="page"/>
       </w:r>
-      <w:bookmarkStart w:id="0" w:name="_Toc229243913"/>
+      <w:bookmarkStart w:id="0" w:name="_Toc230158893"/>
       <w:r>
         <w:rPr>
           <w:rStyle w:val="Forte"/>
@@ -3439,7 +3612,7 @@
           <w:color w:val="auto"/>
         </w:rPr>
       </w:pPr>
-      <w:bookmarkStart w:id="1" w:name="_Toc229243914"/>
+      <w:bookmarkStart w:id="1" w:name="_Toc230158894"/>
       <w:r>
         <w:rPr>
           <w:color w:val="auto"/>
@@ -3516,7 +3689,7 @@
           <w:color w:val="auto"/>
         </w:rPr>
       </w:pPr>
-      <w:bookmarkStart w:id="2" w:name="_Toc229243915"/>
+      <w:bookmarkStart w:id="2" w:name="_Toc230158895"/>
       <w:r>
         <w:rPr>
           <w:color w:val="auto"/>
@@ -3594,7 +3767,7 @@
           <w:color w:val="auto"/>
         </w:rPr>
       </w:pPr>
-      <w:bookmarkStart w:id="3" w:name="_Toc229243916"/>
+      <w:bookmarkStart w:id="3" w:name="_Toc230158896"/>
       <w:r>
         <w:rPr>
           <w:color w:val="auto"/>
@@ -3693,7 +3866,7 @@
           <w:color w:val="auto"/>
         </w:rPr>
       </w:pPr>
-      <w:bookmarkStart w:id="5" w:name="_Toc229243917"/>
+      <w:bookmarkStart w:id="5" w:name="_Toc230158897"/>
       <w:r>
         <w:rPr>
           <w:color w:val="auto"/>
@@ -4047,7 +4220,7 @@
           <w:szCs w:val="24"/>
         </w:rPr>
       </w:pPr>
-      <w:bookmarkStart w:id="6" w:name="_Toc229243918"/>
+      <w:bookmarkStart w:id="6" w:name="_Toc230158898"/>
       <w:r>
         <w:rPr>
           <w:rStyle w:val="Forte"/>
@@ -4290,7 +4463,7 @@
           <w:szCs w:val="24"/>
         </w:rPr>
       </w:pPr>
-      <w:bookmarkStart w:id="7" w:name="_Toc229243919"/>
+      <w:bookmarkStart w:id="7" w:name="_Toc230158899"/>
       <w:r>
         <w:rPr>
           <w:rStyle w:val="Forte"/>
@@ -4384,7 +4557,7 @@
           <w:szCs w:val="24"/>
         </w:rPr>
       </w:pPr>
-      <w:bookmarkStart w:id="8" w:name="_Toc229243920"/>
+      <w:bookmarkStart w:id="8" w:name="_Toc230158900"/>
       <w:r>
         <w:rPr>
           <w:rStyle w:val="Forte"/>
@@ -4417,7 +4590,7 @@
           <w:szCs w:val="24"/>
         </w:rPr>
         <w:drawing>
-          <wp:anchor distT="0" distB="0" distL="114300" distR="114300" simplePos="0" relativeHeight="251658240" behindDoc="0" locked="0" layoutInCell="1" allowOverlap="1" wp14:anchorId="6ECF76D7" wp14:editId="0F74520D">
+          <wp:anchor distT="0" distB="0" distL="114300" distR="114300" simplePos="0" relativeHeight="251658240" behindDoc="0" locked="0" layoutInCell="1" allowOverlap="1" wp14:anchorId="6ECF76D7" wp14:editId="6D29270F">
             <wp:simplePos x="0" y="0"/>
             <wp:positionH relativeFrom="column">
               <wp:posOffset>-241935</wp:posOffset>
@@ -4524,7 +4697,7 @@
           <w:color w:val="auto"/>
         </w:rPr>
       </w:pPr>
-      <w:bookmarkStart w:id="9" w:name="_Toc229243921"/>
+      <w:bookmarkStart w:id="9" w:name="_Toc230158901"/>
       <w:r>
         <w:rPr>
           <w:color w:val="auto"/>
@@ -4568,7 +4741,7 @@
           <w:color w:val="auto"/>
         </w:rPr>
       </w:pPr>
-      <w:bookmarkStart w:id="10" w:name="_Toc229243922"/>
+      <w:bookmarkStart w:id="10" w:name="_Toc230158902"/>
       <w:r>
         <w:rPr>
           <w:color w:val="auto"/>
@@ -4612,7 +4785,7 @@
           <w:color w:val="auto"/>
         </w:rPr>
       </w:pPr>
-      <w:bookmarkStart w:id="11" w:name="_Toc229243923"/>
+      <w:bookmarkStart w:id="11" w:name="_Toc230158903"/>
       <w:r>
         <w:rPr>
           <w:color w:val="auto"/>
@@ -4657,7 +4830,7 @@
           <w:color w:val="auto"/>
         </w:rPr>
       </w:pPr>
-      <w:bookmarkStart w:id="12" w:name="_Toc229243924"/>
+      <w:bookmarkStart w:id="12" w:name="_Toc230158904"/>
       <w:r>
         <w:rPr>
           <w:color w:val="auto"/>
@@ -4714,7 +4887,7 @@
           <w:color w:val="auto"/>
         </w:rPr>
       </w:pPr>
-      <w:bookmarkStart w:id="13" w:name="_Toc229243925"/>
+      <w:bookmarkStart w:id="13" w:name="_Toc230158905"/>
       <w:r>
         <w:rPr>
           <w:color w:val="auto"/>
@@ -4758,7 +4931,7 @@
           <w:color w:val="auto"/>
         </w:rPr>
       </w:pPr>
-      <w:bookmarkStart w:id="14" w:name="_Toc229243926"/>
+      <w:bookmarkStart w:id="14" w:name="_Toc230158906"/>
       <w:r>
         <w:rPr>
           <w:color w:val="auto"/>
@@ -4802,7 +4975,7 @@
           <w:color w:val="auto"/>
         </w:rPr>
       </w:pPr>
-      <w:bookmarkStart w:id="15" w:name="_Toc229243927"/>
+      <w:bookmarkStart w:id="15" w:name="_Toc230158907"/>
       <w:r>
         <w:rPr>
           <w:color w:val="auto"/>
@@ -4846,7 +5019,7 @@
           <w:color w:val="auto"/>
         </w:rPr>
       </w:pPr>
-      <w:bookmarkStart w:id="16" w:name="_Toc229243928"/>
+      <w:bookmarkStart w:id="16" w:name="_Toc230158908"/>
       <w:r>
         <w:rPr>
           <w:color w:val="auto"/>
@@ -4917,7 +5090,7 @@
           <w:szCs w:val="24"/>
         </w:rPr>
       </w:pPr>
-      <w:bookmarkStart w:id="17" w:name="_Toc229243929"/>
+      <w:bookmarkStart w:id="17" w:name="_Toc230158909"/>
       <w:r>
         <w:rPr>
           <w:rStyle w:val="Forte"/>
@@ -5002,7 +5175,7 @@
           <w:color w:val="auto"/>
         </w:rPr>
       </w:pPr>
-      <w:bookmarkStart w:id="18" w:name="_Toc229243930"/>
+      <w:bookmarkStart w:id="18" w:name="_Toc230158910"/>
       <w:r>
         <w:rPr>
           <w:color w:val="auto"/>
@@ -5309,7 +5482,7 @@
                 <w:noProof/>
               </w:rPr>
               <w:drawing>
-                <wp:inline distT="0" distB="0" distL="0" distR="0" wp14:anchorId="3EEB6DC0" wp14:editId="6F04350E">
+                <wp:inline distT="0" distB="0" distL="0" distR="0" wp14:anchorId="3EEB6DC0" wp14:editId="32471CD0">
                   <wp:extent cx="5439796" cy="2007940"/>
                   <wp:effectExtent l="0" t="0" r="8890" b="0"/>
                   <wp:docPr id="24602256" name="Imagem 4"/>
@@ -5556,7 +5729,7 @@
           <w:color w:val="auto"/>
         </w:rPr>
       </w:pPr>
-      <w:bookmarkStart w:id="19" w:name="_Toc229243931"/>
+      <w:bookmarkStart w:id="19" w:name="_Toc230158911"/>
       <w:r>
         <w:rPr>
           <w:color w:val="auto"/>
@@ -5885,7 +6058,7 @@
           <w:color w:val="auto"/>
         </w:rPr>
       </w:pPr>
-      <w:bookmarkStart w:id="20" w:name="_Toc229243932"/>
+      <w:bookmarkStart w:id="20" w:name="_Toc230158912"/>
       <w:r>
         <w:rPr>
           <w:color w:val="auto"/>
@@ -6403,7 +6576,7 @@
           <w:color w:val="auto"/>
         </w:rPr>
       </w:pPr>
-      <w:bookmarkStart w:id="21" w:name="_Toc229243933"/>
+      <w:bookmarkStart w:id="21" w:name="_Toc230158913"/>
       <w:r>
         <w:rPr>
           <w:color w:val="auto"/>
@@ -6890,7 +7063,7 @@
           <w:color w:val="auto"/>
         </w:rPr>
       </w:pPr>
-      <w:bookmarkStart w:id="22" w:name="_Toc229243934"/>
+      <w:bookmarkStart w:id="22" w:name="_Toc230158914"/>
       <w:r>
         <w:rPr>
           <w:color w:val="auto"/>
@@ -7000,7 +7173,7 @@
           <w:color w:val="auto"/>
         </w:rPr>
       </w:pPr>
-      <w:bookmarkStart w:id="23" w:name="_Toc229243935"/>
+      <w:bookmarkStart w:id="23" w:name="_Toc230158915"/>
       <w:r>
         <w:rPr>
           <w:color w:val="auto"/>
@@ -7088,7 +7261,7 @@
           <w:szCs w:val="24"/>
         </w:rPr>
       </w:pPr>
-      <w:bookmarkStart w:id="24" w:name="_Toc229243936"/>
+      <w:bookmarkStart w:id="24" w:name="_Toc230158916"/>
       <w:r>
         <w:rPr>
           <w:rStyle w:val="Forte"/>
@@ -7271,7 +7444,7 @@
           <w:szCs w:val="24"/>
         </w:rPr>
       </w:pPr>
-      <w:bookmarkStart w:id="25" w:name="_Toc229243937"/>
+      <w:bookmarkStart w:id="25" w:name="_Toc230158917"/>
       <w:r>
         <w:rPr>
           <w:rStyle w:val="Forte"/>
@@ -7469,7 +7642,7 @@
           <w:szCs w:val="24"/>
         </w:rPr>
       </w:pPr>
-      <w:bookmarkStart w:id="26" w:name="_Toc229243938"/>
+      <w:bookmarkStart w:id="26" w:name="_Toc230158918"/>
       <w:r>
         <w:rPr>
           <w:rStyle w:val="Forte"/>
@@ -7529,20 +7702,9 @@
       </w:r>
     </w:p>
     <w:p>
-      <w:pPr>
-        <w:autoSpaceDE w:val="0"/>
-        <w:autoSpaceDN w:val="0"/>
-        <w:adjustRightInd w:val="0"/>
-        <w:spacing w:after="0"/>
-        <w:jc w:val="both"/>
-        <w:rPr>
-          <w:rFonts w:ascii="Arial" w:hAnsi="Arial" w:cs="Arial"/>
-          <w:i/>
-          <w:iCs/>
-          <w:sz w:val="24"/>
-          <w:szCs w:val="24"/>
-        </w:rPr>
-      </w:pPr>
+      <w:r>
+        <w:t>‘</w:t>
+      </w:r>
       <w:hyperlink r:id="rId18" w:history="1">
         <w:r>
           <w:rPr>
@@ -7553,45 +7715,11 @@
             <w:sz w:val="24"/>
             <w:szCs w:val="24"/>
           </w:rPr>
-          <w:t>https://github.com/gracianFelipe/Projeto_Aplicado_III</w:t>
+          <w:t>https://github.com/cristianomack/projeto-aplicado-3</w:t>
         </w:r>
       </w:hyperlink>
     </w:p>
-    <w:p>
-      <w:pPr>
-        <w:rPr>
-          <w:rFonts w:ascii="Arial" w:eastAsia="Arial" w:hAnsi="Arial" w:cs="Arial"/>
-          <w:b/>
-          <w:bCs/>
-          <w:color w:val="000000" w:themeColor="text1"/>
-          <w:sz w:val="24"/>
-          <w:szCs w:val="24"/>
-        </w:rPr>
-      </w:pPr>
-    </w:p>
-    <w:p>
-      <w:pPr>
-        <w:rPr>
-          <w:rFonts w:ascii="Arial" w:eastAsia="Arial" w:hAnsi="Arial" w:cs="Arial"/>
-          <w:b/>
-          <w:bCs/>
-          <w:color w:val="000000" w:themeColor="text1"/>
-          <w:sz w:val="24"/>
-          <w:szCs w:val="24"/>
-        </w:rPr>
-      </w:pPr>
-      <w:r>
-        <w:rPr>
-          <w:rFonts w:ascii="Arial" w:eastAsia="Arial" w:hAnsi="Arial" w:cs="Arial"/>
-          <w:b/>
-          <w:bCs/>
-          <w:color w:val="000000" w:themeColor="text1"/>
-          <w:sz w:val="24"/>
-          <w:szCs w:val="24"/>
-        </w:rPr>
-        <w:br w:type="page"/>
-      </w:r>
-    </w:p>
+    <w:p/>
     <w:p>
       <w:pPr>
         <w:pStyle w:val="Ttulo1"/>
@@ -7602,14 +7730,234 @@
         <w:rPr>
           <w:rStyle w:val="Forte"/>
           <w:rFonts w:ascii="Arial" w:hAnsi="Arial" w:cs="Arial"/>
-          <w:bCs w:val="0"/>
           <w:color w:val="auto"/>
           <w:sz w:val="24"/>
           <w:szCs w:val="24"/>
         </w:rPr>
       </w:pPr>
-      <w:bookmarkStart w:id="27" w:name="_Toc229243939"/>
-      <w:r>
+      <w:bookmarkStart w:id="27" w:name="_Toc230158919"/>
+      <w:r>
+        <w:rPr>
+          <w:rStyle w:val="Forte"/>
+          <w:rFonts w:ascii="Arial" w:hAnsi="Arial" w:cs="Arial"/>
+          <w:color w:val="auto"/>
+          <w:sz w:val="24"/>
+          <w:szCs w:val="24"/>
+        </w:rPr>
+        <w:t>Link para o vídeo</w:t>
+      </w:r>
+      <w:bookmarkEnd w:id="27"/>
+    </w:p>
+    <w:p>
+      <w:pPr>
+        <w:spacing w:after="0"/>
+        <w:ind w:firstLine="360"/>
+        <w:jc w:val="both"/>
+        <w:rPr>
+          <w:rFonts w:ascii="Arial" w:eastAsia="Times New Roman" w:hAnsi="Arial" w:cs="Arial"/>
+          <w:sz w:val="24"/>
+          <w:szCs w:val="24"/>
+          <w:lang w:eastAsia="pt-BR"/>
+        </w:rPr>
+      </w:pPr>
+      <w:r>
+        <w:rPr>
+          <w:rFonts w:ascii="Arial" w:eastAsia="Times New Roman" w:hAnsi="Arial" w:cs="Arial"/>
+          <w:sz w:val="24"/>
+          <w:szCs w:val="24"/>
+          <w:lang w:eastAsia="pt-BR"/>
+        </w:rPr>
+        <w:t>O vídeo pode ser assistido em:</w:t>
+      </w:r>
+    </w:p>
+    <w:p>
+      <w:pPr>
+        <w:spacing w:after="0"/>
+        <w:ind w:firstLine="360"/>
+        <w:jc w:val="both"/>
+        <w:rPr>
+          <w:rFonts w:ascii="Arial" w:eastAsia="Times New Roman" w:hAnsi="Arial" w:cs="Arial"/>
+          <w:i/>
+          <w:iCs/>
+          <w:sz w:val="24"/>
+          <w:szCs w:val="24"/>
+          <w:lang w:eastAsia="pt-BR"/>
+        </w:rPr>
+      </w:pPr>
+      <w:hyperlink r:id="rId19" w:history="1">
+        <w:r>
+          <w:rPr>
+            <w:rStyle w:val="Hyperlink"/>
+            <w:rFonts w:ascii="Arial" w:eastAsia="Times New Roman" w:hAnsi="Arial" w:cs="Arial"/>
+            <w:i/>
+            <w:iCs/>
+            <w:sz w:val="24"/>
+            <w:szCs w:val="24"/>
+            <w:lang w:eastAsia="pt-BR"/>
+          </w:rPr>
+          <w:t>https://www.youtube.com/watch?v=or935Y0YRTg&amp;t=2s</w:t>
+        </w:r>
+      </w:hyperlink>
+    </w:p>
+    <w:p>
+      <w:pPr>
+        <w:spacing w:after="0"/>
+        <w:ind w:firstLine="360"/>
+        <w:jc w:val="both"/>
+        <w:rPr>
+          <w:rFonts w:ascii="Arial" w:eastAsia="Times New Roman" w:hAnsi="Arial" w:cs="Arial"/>
+          <w:sz w:val="24"/>
+          <w:szCs w:val="24"/>
+          <w:lang w:eastAsia="pt-BR"/>
+        </w:rPr>
+      </w:pPr>
+    </w:p>
+    <w:p>
+      <w:pPr>
+        <w:pStyle w:val="Ttulo1"/>
+        <w:numPr>
+          <w:ilvl w:val="0"/>
+          <w:numId w:val="40"/>
+        </w:numPr>
+        <w:rPr>
+          <w:rStyle w:val="Forte"/>
+          <w:rFonts w:ascii="Arial" w:hAnsi="Arial" w:cs="Arial"/>
+          <w:color w:val="auto"/>
+          <w:sz w:val="24"/>
+          <w:szCs w:val="24"/>
+        </w:rPr>
+      </w:pPr>
+      <w:bookmarkStart w:id="28" w:name="_Toc230158920"/>
+      <w:r>
+        <w:rPr>
+          <w:rStyle w:val="Forte"/>
+          <w:rFonts w:ascii="Arial" w:hAnsi="Arial" w:cs="Arial"/>
+          <w:color w:val="auto"/>
+          <w:sz w:val="24"/>
+          <w:szCs w:val="24"/>
+        </w:rPr>
+        <w:t>Link para a Aplicação</w:t>
+      </w:r>
+      <w:bookmarkEnd w:id="28"/>
+    </w:p>
+    <w:p>
+      <w:pPr>
+        <w:spacing w:after="0"/>
+        <w:ind w:firstLine="360"/>
+        <w:jc w:val="both"/>
+        <w:rPr>
+          <w:rFonts w:ascii="Arial" w:eastAsia="Times New Roman" w:hAnsi="Arial" w:cs="Arial"/>
+          <w:sz w:val="24"/>
+          <w:szCs w:val="24"/>
+          <w:lang w:eastAsia="pt-BR"/>
+        </w:rPr>
+      </w:pPr>
+    </w:p>
+    <w:p>
+      <w:pPr>
+        <w:spacing w:after="0"/>
+        <w:ind w:firstLine="360"/>
+        <w:jc w:val="both"/>
+        <w:rPr>
+          <w:rFonts w:ascii="Arial" w:eastAsia="Times New Roman" w:hAnsi="Arial" w:cs="Arial"/>
+          <w:sz w:val="24"/>
+          <w:szCs w:val="24"/>
+          <w:lang w:eastAsia="pt-BR"/>
+        </w:rPr>
+      </w:pPr>
+      <w:r>
+        <w:rPr>
+          <w:rFonts w:ascii="Arial" w:eastAsia="Times New Roman" w:hAnsi="Arial" w:cs="Arial"/>
+          <w:sz w:val="24"/>
+          <w:szCs w:val="24"/>
+          <w:lang w:eastAsia="pt-BR"/>
+        </w:rPr>
+        <w:t>A aplicação pode ser acessada e testa da em:</w:t>
+      </w:r>
+    </w:p>
+    <w:p>
+      <w:pPr>
+        <w:spacing w:after="0"/>
+        <w:ind w:firstLine="360"/>
+        <w:jc w:val="both"/>
+        <w:rPr>
+          <w:rFonts w:ascii="Arial" w:eastAsia="Times New Roman" w:hAnsi="Arial" w:cs="Arial"/>
+          <w:i/>
+          <w:iCs/>
+          <w:sz w:val="24"/>
+          <w:szCs w:val="24"/>
+          <w:lang w:eastAsia="pt-BR"/>
+        </w:rPr>
+      </w:pPr>
+      <w:hyperlink r:id="rId20" w:history="1">
+        <w:r>
+          <w:rPr>
+            <w:rStyle w:val="Hyperlink"/>
+            <w:rFonts w:ascii="Arial" w:eastAsia="Times New Roman" w:hAnsi="Arial" w:cs="Arial"/>
+            <w:i/>
+            <w:iCs/>
+            <w:sz w:val="24"/>
+            <w:szCs w:val="24"/>
+            <w:lang w:eastAsia="pt-BR"/>
+          </w:rPr>
+          <w:t>https://mack-pa3.streamlit.app/</w:t>
+        </w:r>
+      </w:hyperlink>
+    </w:p>
+    <w:p>
+      <w:pPr>
+        <w:rPr>
+          <w:rFonts w:ascii="Arial" w:eastAsia="Arial" w:hAnsi="Arial" w:cs="Arial"/>
+          <w:b/>
+          <w:bCs/>
+          <w:color w:val="000000" w:themeColor="text1"/>
+          <w:sz w:val="24"/>
+          <w:szCs w:val="24"/>
+        </w:rPr>
+      </w:pPr>
+    </w:p>
+    <w:p>
+      <w:pPr>
+        <w:rPr>
+          <w:rFonts w:ascii="Arial" w:eastAsia="Arial" w:hAnsi="Arial" w:cs="Arial"/>
+          <w:b/>
+          <w:bCs/>
+          <w:color w:val="000000" w:themeColor="text1"/>
+          <w:sz w:val="24"/>
+          <w:szCs w:val="24"/>
+        </w:rPr>
+      </w:pPr>
+    </w:p>
+    <w:p>
+      <w:pPr>
+        <w:rPr>
+          <w:rFonts w:ascii="Arial" w:eastAsia="Arial" w:hAnsi="Arial" w:cs="Arial"/>
+          <w:b/>
+          <w:bCs/>
+          <w:color w:val="000000" w:themeColor="text1"/>
+          <w:sz w:val="24"/>
+          <w:szCs w:val="24"/>
+        </w:rPr>
+      </w:pPr>
+      <w:r>
+        <w:rPr>
+          <w:rFonts w:ascii="Arial" w:eastAsia="Arial" w:hAnsi="Arial" w:cs="Arial"/>
+          <w:b/>
+          <w:bCs/>
+          <w:color w:val="000000" w:themeColor="text1"/>
+          <w:sz w:val="24"/>
+          <w:szCs w:val="24"/>
+        </w:rPr>
+        <w:br w:type="page"/>
+      </w:r>
+    </w:p>
+    <w:p>
+      <w:pPr>
+        <w:pStyle w:val="Ttulo1"/>
+        <w:numPr>
+          <w:ilvl w:val="0"/>
+          <w:numId w:val="40"/>
+        </w:numPr>
         <w:rPr>
           <w:rStyle w:val="Forte"/>
           <w:rFonts w:ascii="Arial" w:hAnsi="Arial" w:cs="Arial"/>
@@ -7618,9 +7966,8 @@
           <w:sz w:val="24"/>
           <w:szCs w:val="24"/>
         </w:rPr>
-        <w:lastRenderedPageBreak/>
-        <w:t>Referências</w:t>
-      </w:r>
+      </w:pPr>
+      <w:bookmarkStart w:id="29" w:name="_Toc230158921"/>
       <w:r>
         <w:rPr>
           <w:rStyle w:val="Forte"/>
@@ -7630,9 +7977,21 @@
           <w:sz w:val="24"/>
           <w:szCs w:val="24"/>
         </w:rPr>
+        <w:lastRenderedPageBreak/>
+        <w:t>Referências</w:t>
+      </w:r>
+      <w:r>
+        <w:rPr>
+          <w:rStyle w:val="Forte"/>
+          <w:rFonts w:ascii="Arial" w:hAnsi="Arial" w:cs="Arial"/>
+          <w:bCs w:val="0"/>
+          <w:color w:val="auto"/>
+          <w:sz w:val="24"/>
+          <w:szCs w:val="24"/>
+        </w:rPr>
         <w:t xml:space="preserve"> Bibliográficas</w:t>
       </w:r>
-      <w:bookmarkEnd w:id="27"/>
+      <w:bookmarkEnd w:id="29"/>
     </w:p>
     <w:p>
       <w:pPr>
@@ -8419,10 +8778,10 @@
       </w:pPr>
     </w:p>
     <w:sectPr>
-      <w:headerReference w:type="default" r:id="rId19"/>
-      <w:footerReference w:type="default" r:id="rId20"/>
-      <w:headerReference w:type="first" r:id="rId21"/>
-      <w:footerReference w:type="first" r:id="rId22"/>
+      <w:headerReference w:type="default" r:id="rId21"/>
+      <w:footerReference w:type="default" r:id="rId22"/>
+      <w:headerReference w:type="first" r:id="rId23"/>
+      <w:footerReference w:type="first" r:id="rId24"/>
       <w:pgSz w:w="11906" w:h="16838"/>
       <w:pgMar w:top="1417" w:right="1701" w:bottom="993" w:left="1701" w:header="142" w:footer="170" w:gutter="0"/>
       <w:cols w:space="708"/>

</xml_diff>